<commit_message>
L-0675 review: rebuild the configuration-reference and memory-and-obsidian guides
Codex round 1 FIX: the DOCX/PDF still said 143 keys and lacked the recall
project guidance; the memory guide's HTML also missed the round-1 wording.

Claude-Session: https://claude.ai/code/session_01QLY3kk7DCXpucXGu3wSniW
</commit_message>
<xml_diff>
--- a/docs/guides/crew/crew-configuration-reference.docx
+++ b/docs/guides/crew/crew-configuration-reference.docx
@@ -970,11 +970,11 @@
         <w:rPr>
           <w:rStyle w:val="Strong"/>
         </w:rPr>
-        <w:t>143 keys</w:t>
+        <w:t>144 keys</w:t>
       </w:r>
       <w:r>
         <w:rPr/>
-        <w:t>: 83 settable in the machine-global file, 60 repo-only.</w:t>
+        <w:t>: 83 settable in the machine-global file, 61 repo-only.</w:t>
       </w:r>
     </w:p>
     <w:p>
@@ -8888,12 +8888,12 @@
         </w:tblCellMar>
       </w:tblPr>
       <w:tblGrid>
-        <w:gridCol w:w="3435"/>
-        <w:gridCol w:w="1346"/>
+        <w:gridCol w:w="3491"/>
+        <w:gridCol w:w="1347"/>
         <w:gridCol w:w="1156"/>
-        <w:gridCol w:w="2916"/>
-        <w:gridCol w:w="1262"/>
-        <w:gridCol w:w="2656"/>
+        <w:gridCol w:w="2560"/>
+        <w:gridCol w:w="1272"/>
+        <w:gridCol w:w="2945"/>
       </w:tblGrid>
       <w:tr>
         <w:trPr>
@@ -8901,7 +8901,7 @@
         </w:trPr>
         <w:tc>
           <w:tcPr>
-            <w:tcW w:w="3435" w:type="dxa"/>
+            <w:tcW w:w="3491" w:type="dxa"/>
             <w:tcBorders/>
             <w:vAlign w:val="center"/>
           </w:tcPr>
@@ -8923,7 +8923,7 @@
         </w:tc>
         <w:tc>
           <w:tcPr>
-            <w:tcW w:w="1346" w:type="dxa"/>
+            <w:tcW w:w="1347" w:type="dxa"/>
             <w:tcBorders/>
             <w:vAlign w:val="center"/>
           </w:tcPr>
@@ -8967,7 +8967,7 @@
         </w:tc>
         <w:tc>
           <w:tcPr>
-            <w:tcW w:w="2916" w:type="dxa"/>
+            <w:tcW w:w="2560" w:type="dxa"/>
             <w:tcBorders/>
             <w:vAlign w:val="center"/>
           </w:tcPr>
@@ -8989,7 +8989,7 @@
         </w:tc>
         <w:tc>
           <w:tcPr>
-            <w:tcW w:w="1262" w:type="dxa"/>
+            <w:tcW w:w="1272" w:type="dxa"/>
             <w:tcBorders/>
             <w:vAlign w:val="center"/>
           </w:tcPr>
@@ -9011,7 +9011,7 @@
         </w:tc>
         <w:tc>
           <w:tcPr>
-            <w:tcW w:w="2656" w:type="dxa"/>
+            <w:tcW w:w="2945" w:type="dxa"/>
             <w:tcBorders/>
             <w:vAlign w:val="center"/>
           </w:tcPr>
@@ -9036,7 +9036,7 @@
         <w:trPr/>
         <w:tc>
           <w:tcPr>
-            <w:tcW w:w="3435" w:type="dxa"/>
+            <w:tcW w:w="3491" w:type="dxa"/>
             <w:tcBorders/>
             <w:vAlign w:val="center"/>
           </w:tcPr>
@@ -9059,7 +9059,7 @@
         </w:tc>
         <w:tc>
           <w:tcPr>
-            <w:tcW w:w="1346" w:type="dxa"/>
+            <w:tcW w:w="1347" w:type="dxa"/>
             <w:tcBorders/>
             <w:vAlign w:val="center"/>
           </w:tcPr>
@@ -9103,7 +9103,7 @@
         </w:tc>
         <w:tc>
           <w:tcPr>
-            <w:tcW w:w="2916" w:type="dxa"/>
+            <w:tcW w:w="2560" w:type="dxa"/>
             <w:tcBorders/>
             <w:vAlign w:val="center"/>
           </w:tcPr>
@@ -9134,7 +9134,7 @@
         </w:tc>
         <w:tc>
           <w:tcPr>
-            <w:tcW w:w="1262" w:type="dxa"/>
+            <w:tcW w:w="1272" w:type="dxa"/>
             <w:tcBorders/>
             <w:vAlign w:val="center"/>
           </w:tcPr>
@@ -9155,7 +9155,7 @@
         </w:tc>
         <w:tc>
           <w:tcPr>
-            <w:tcW w:w="2656" w:type="dxa"/>
+            <w:tcW w:w="2945" w:type="dxa"/>
             <w:tcBorders/>
             <w:vAlign w:val="center"/>
           </w:tcPr>
@@ -9189,7 +9189,7 @@
         <w:trPr/>
         <w:tc>
           <w:tcPr>
-            <w:tcW w:w="3435" w:type="dxa"/>
+            <w:tcW w:w="3491" w:type="dxa"/>
             <w:tcBorders/>
             <w:vAlign w:val="center"/>
           </w:tcPr>
@@ -9212,7 +9212,7 @@
         </w:tc>
         <w:tc>
           <w:tcPr>
-            <w:tcW w:w="1346" w:type="dxa"/>
+            <w:tcW w:w="1347" w:type="dxa"/>
             <w:tcBorders/>
             <w:vAlign w:val="center"/>
           </w:tcPr>
@@ -9256,7 +9256,7 @@
         </w:tc>
         <w:tc>
           <w:tcPr>
-            <w:tcW w:w="2916" w:type="dxa"/>
+            <w:tcW w:w="2560" w:type="dxa"/>
             <w:tcBorders/>
             <w:vAlign w:val="center"/>
           </w:tcPr>
@@ -9287,7 +9287,7 @@
         </w:tc>
         <w:tc>
           <w:tcPr>
-            <w:tcW w:w="1262" w:type="dxa"/>
+            <w:tcW w:w="1272" w:type="dxa"/>
             <w:tcBorders/>
             <w:vAlign w:val="center"/>
           </w:tcPr>
@@ -9308,7 +9308,7 @@
         </w:tc>
         <w:tc>
           <w:tcPr>
-            <w:tcW w:w="2656" w:type="dxa"/>
+            <w:tcW w:w="2945" w:type="dxa"/>
             <w:tcBorders/>
             <w:vAlign w:val="center"/>
           </w:tcPr>
@@ -9332,7 +9332,7 @@
         <w:trPr/>
         <w:tc>
           <w:tcPr>
-            <w:tcW w:w="3435" w:type="dxa"/>
+            <w:tcW w:w="3491" w:type="dxa"/>
             <w:tcBorders/>
             <w:vAlign w:val="center"/>
           </w:tcPr>
@@ -9355,7 +9355,7 @@
         </w:tc>
         <w:tc>
           <w:tcPr>
-            <w:tcW w:w="1346" w:type="dxa"/>
+            <w:tcW w:w="1347" w:type="dxa"/>
             <w:tcBorders/>
             <w:vAlign w:val="center"/>
           </w:tcPr>
@@ -9399,7 +9399,7 @@
         </w:tc>
         <w:tc>
           <w:tcPr>
-            <w:tcW w:w="2916" w:type="dxa"/>
+            <w:tcW w:w="2560" w:type="dxa"/>
             <w:tcBorders/>
             <w:vAlign w:val="center"/>
           </w:tcPr>
@@ -9430,7 +9430,7 @@
         </w:tc>
         <w:tc>
           <w:tcPr>
-            <w:tcW w:w="1262" w:type="dxa"/>
+            <w:tcW w:w="1272" w:type="dxa"/>
             <w:tcBorders/>
             <w:vAlign w:val="center"/>
           </w:tcPr>
@@ -9451,7 +9451,7 @@
         </w:tc>
         <w:tc>
           <w:tcPr>
-            <w:tcW w:w="2656" w:type="dxa"/>
+            <w:tcW w:w="2945" w:type="dxa"/>
             <w:tcBorders/>
             <w:vAlign w:val="center"/>
           </w:tcPr>
@@ -9485,7 +9485,7 @@
         <w:trPr/>
         <w:tc>
           <w:tcPr>
-            <w:tcW w:w="3435" w:type="dxa"/>
+            <w:tcW w:w="3491" w:type="dxa"/>
             <w:tcBorders/>
             <w:vAlign w:val="center"/>
           </w:tcPr>
@@ -9508,7 +9508,7 @@
         </w:tc>
         <w:tc>
           <w:tcPr>
-            <w:tcW w:w="1346" w:type="dxa"/>
+            <w:tcW w:w="1347" w:type="dxa"/>
             <w:tcBorders/>
             <w:vAlign w:val="center"/>
           </w:tcPr>
@@ -9552,7 +9552,7 @@
         </w:tc>
         <w:tc>
           <w:tcPr>
-            <w:tcW w:w="2916" w:type="dxa"/>
+            <w:tcW w:w="2560" w:type="dxa"/>
             <w:tcBorders/>
             <w:vAlign w:val="center"/>
           </w:tcPr>
@@ -9583,7 +9583,7 @@
         </w:tc>
         <w:tc>
           <w:tcPr>
-            <w:tcW w:w="1262" w:type="dxa"/>
+            <w:tcW w:w="1272" w:type="dxa"/>
             <w:tcBorders/>
             <w:vAlign w:val="center"/>
           </w:tcPr>
@@ -9604,7 +9604,7 @@
         </w:tc>
         <w:tc>
           <w:tcPr>
-            <w:tcW w:w="2656" w:type="dxa"/>
+            <w:tcW w:w="2945" w:type="dxa"/>
             <w:tcBorders/>
             <w:vAlign w:val="center"/>
           </w:tcPr>
@@ -9628,7 +9628,7 @@
         <w:trPr/>
         <w:tc>
           <w:tcPr>
-            <w:tcW w:w="3435" w:type="dxa"/>
+            <w:tcW w:w="3491" w:type="dxa"/>
             <w:tcBorders/>
             <w:vAlign w:val="center"/>
           </w:tcPr>
@@ -9651,7 +9651,7 @@
         </w:tc>
         <w:tc>
           <w:tcPr>
-            <w:tcW w:w="1346" w:type="dxa"/>
+            <w:tcW w:w="1347" w:type="dxa"/>
             <w:tcBorders/>
             <w:vAlign w:val="center"/>
           </w:tcPr>
@@ -9695,7 +9695,7 @@
         </w:tc>
         <w:tc>
           <w:tcPr>
-            <w:tcW w:w="2916" w:type="dxa"/>
+            <w:tcW w:w="2560" w:type="dxa"/>
             <w:tcBorders/>
             <w:vAlign w:val="center"/>
           </w:tcPr>
@@ -9726,7 +9726,7 @@
         </w:tc>
         <w:tc>
           <w:tcPr>
-            <w:tcW w:w="1262" w:type="dxa"/>
+            <w:tcW w:w="1272" w:type="dxa"/>
             <w:tcBorders/>
             <w:vAlign w:val="center"/>
           </w:tcPr>
@@ -9747,7 +9747,7 @@
         </w:tc>
         <w:tc>
           <w:tcPr>
-            <w:tcW w:w="2656" w:type="dxa"/>
+            <w:tcW w:w="2945" w:type="dxa"/>
             <w:tcBorders/>
             <w:vAlign w:val="center"/>
           </w:tcPr>
@@ -9763,6 +9763,159 @@
             <w:r>
               <w:rPr/>
               <w:t>Recall output budget; a non-positive or non-integer value reads as 800.</w:t>
+            </w:r>
+          </w:p>
+        </w:tc>
+      </w:tr>
+      <w:tr>
+        <w:trPr/>
+        <w:tc>
+          <w:tcPr>
+            <w:tcW w:w="3491" w:type="dxa"/>
+            <w:tcBorders/>
+            <w:vAlign w:val="center"/>
+          </w:tcPr>
+          <w:p>
+            <w:pPr>
+              <w:pStyle w:val="TableContents"/>
+              <w:shd w:fill="2E3440" w:val="clear"/>
+              <w:bidi w:val="0"/>
+              <w:spacing w:before="120" w:after="120"/>
+              <w:jc w:val="left"/>
+              <w:rPr/>
+            </w:pPr>
+            <w:r>
+              <w:rPr>
+                <w:rStyle w:val="SourceText"/>
+              </w:rPr>
+              <w:t>memory.recall.projects</w:t>
+            </w:r>
+          </w:p>
+        </w:tc>
+        <w:tc>
+          <w:tcPr>
+            <w:tcW w:w="1347" w:type="dxa"/>
+            <w:tcBorders/>
+            <w:vAlign w:val="center"/>
+          </w:tcPr>
+          <w:p>
+            <w:pPr>
+              <w:pStyle w:val="TableContents"/>
+              <w:shd w:fill="2E3440" w:val="clear"/>
+              <w:bidi w:val="0"/>
+              <w:spacing w:before="120" w:after="120"/>
+              <w:jc w:val="left"/>
+              <w:rPr/>
+            </w:pPr>
+            <w:r>
+              <w:rPr/>
+              <w:t>repo</w:t>
+            </w:r>
+          </w:p>
+        </w:tc>
+        <w:tc>
+          <w:tcPr>
+            <w:tcW w:w="1156" w:type="dxa"/>
+            <w:tcBorders/>
+            <w:vAlign w:val="center"/>
+          </w:tcPr>
+          <w:p>
+            <w:pPr>
+              <w:pStyle w:val="TableContents"/>
+              <w:shd w:fill="2E3440" w:val="clear"/>
+              <w:bidi w:val="0"/>
+              <w:spacing w:before="120" w:after="120"/>
+              <w:jc w:val="left"/>
+              <w:rPr/>
+            </w:pPr>
+            <w:r>
+              <w:rPr>
+                <w:rStyle w:val="SourceText"/>
+              </w:rPr>
+              <w:t>[]</w:t>
+            </w:r>
+          </w:p>
+        </w:tc>
+        <w:tc>
+          <w:tcPr>
+            <w:tcW w:w="2560" w:type="dxa"/>
+            <w:tcBorders/>
+            <w:vAlign w:val="center"/>
+          </w:tcPr>
+          <w:p>
+            <w:pPr>
+              <w:pStyle w:val="TableContents"/>
+              <w:shd w:fill="2E3440" w:val="clear"/>
+              <w:bidi w:val="0"/>
+              <w:spacing w:before="120" w:after="120"/>
+              <w:jc w:val="left"/>
+              <w:rPr/>
+            </w:pPr>
+            <w:r>
+              <w:rPr/>
+              <w:t xml:space="preserve">not validated - read by </w:t>
+            </w:r>
+            <w:r>
+              <w:rPr>
+                <w:rStyle w:val="SourceText"/>
+              </w:rPr>
+              <w:t>plugin/crew/hooks/scripts/crew_recall.py</w:t>
+            </w:r>
+            <w:r>
+              <w:rPr/>
+              <w:t xml:space="preserve"> (expects list of project names)</w:t>
+            </w:r>
+          </w:p>
+        </w:tc>
+        <w:tc>
+          <w:tcPr>
+            <w:tcW w:w="1272" w:type="dxa"/>
+            <w:tcBorders/>
+            <w:vAlign w:val="center"/>
+          </w:tcPr>
+          <w:p>
+            <w:pPr>
+              <w:pStyle w:val="TableContents"/>
+              <w:shd w:fill="2E3440" w:val="clear"/>
+              <w:bidi w:val="0"/>
+              <w:spacing w:before="120" w:after="120"/>
+              <w:jc w:val="left"/>
+              <w:rPr/>
+            </w:pPr>
+            <w:r>
+              <w:rPr/>
+              <w:t>1.1.7</w:t>
+            </w:r>
+          </w:p>
+        </w:tc>
+        <w:tc>
+          <w:tcPr>
+            <w:tcW w:w="2945" w:type="dxa"/>
+            <w:tcBorders/>
+            <w:vAlign w:val="center"/>
+          </w:tcPr>
+          <w:p>
+            <w:pPr>
+              <w:pStyle w:val="TableContents"/>
+              <w:shd w:fill="2E3440" w:val="clear"/>
+              <w:bidi w:val="0"/>
+              <w:spacing w:before="120" w:after="120"/>
+              <w:jc w:val="left"/>
+              <w:rPr/>
+            </w:pPr>
+            <w:r>
+              <w:rPr/>
+              <w:t xml:space="preserve">Project names sent to vault recall as </w:t>
+            </w:r>
+            <w:r>
+              <w:rPr>
+                <w:rStyle w:val="SourceText"/>
+              </w:rPr>
+              <w:t>--project</w:t>
+            </w:r>
+            <w:r>
+              <w:rPr/>
+              <w:t xml:space="preserve"> so this repo's notes rank first; empty sends the main checkout's directory name.</w:t>
             </w:r>
           </w:p>
         </w:tc>

</xml_diff>

<commit_message>
T-0038 port: live docs stop naming /crew:upgrade as a command (PLUGINS.md, guide, configuration reference, root README); migrate.md back to 120 lines; guides rebuilt; rules regenerated
Claude-Session: https://claude.ai/code/session_01QLY3kk7DCXpucXGu3wSniW
</commit_message>
<xml_diff>
--- a/docs/guides/crew/crew-configuration-reference.docx
+++ b/docs/guides/crew/crew-configuration-reference.docx
@@ -1717,11 +1717,11 @@
               <w:rPr>
                 <w:rStyle w:val="SourceText"/>
               </w:rPr>
-              <w:t>/crew:upgrade</w:t>
-            </w:r>
-            <w:r>
-              <w:rPr/>
-              <w:t xml:space="preserve"> migrates an older one.</w:t>
+              <w:t>/crew:migrate</w:t>
+            </w:r>
+            <w:r>
+              <w:rPr/>
+              <w:t xml:space="preserve"> upgrades an older one.</w:t>
             </w:r>
           </w:p>
         </w:tc>

</xml_diff>

<commit_message>
L-0654: sleep deploy override, nonprod only; production always waits while asleep
- crew_sleep: autopilot.sleep.deploy (null|nonprod|none; all or anything
  else refused with a warning, the day value stands); deploy_overlay applies
  it asleep (stricter-only under tightenOnly) and reads an effective all as
  nonprod. Awake, off or unknown, the day value stands.
- crew_autopilot: _settings_at returns the overlaid deploy and day.deploy;
  deploy_allowed's reason names the sleep state when it changed the answer.
  No anchored line of _decide changes; the file stays at 3400 lines.
- key declared in AUTOPILOT_DEFAULTS, KEY_META, the template, the setup
  skill's inline copy and the config menu; leaf count 146.
- tests: must-allow, must-block, awake production unchanged, and a
  hand-written state x day x override x class matrix.

Claude-Session: https://claude.ai/code/session_01QLY3kk7DCXpucXGu3wSniW
</commit_message>
<xml_diff>
--- a/docs/guides/crew/crew-configuration-reference.docx
+++ b/docs/guides/crew/crew-configuration-reference.docx
@@ -970,11 +970,11 @@
         <w:rPr>
           <w:rStyle w:val="Strong"/>
         </w:rPr>
-        <w:t>149 keys</w:t>
+        <w:t>150 keys</w:t>
       </w:r>
       <w:r>
         <w:rPr/>
-        <w:t>: 87 settable in the machine-global file, 62 repo-only.</w:t>
+        <w:t>: 87 settable in the machine-global file, 63 repo-only.</w:t>
       </w:r>
     </w:p>
     <w:p>
@@ -26249,9 +26249,9 @@
         <w:gridCol w:w="3968"/>
         <w:gridCol w:w="1134"/>
         <w:gridCol w:w="1156"/>
-        <w:gridCol w:w="2141"/>
+        <w:gridCol w:w="2061"/>
         <w:gridCol w:w="1242"/>
-        <w:gridCol w:w="3130"/>
+        <w:gridCol w:w="3210"/>
       </w:tblGrid>
       <w:tr>
         <w:trPr>
@@ -26325,7 +26325,7 @@
         </w:tc>
         <w:tc>
           <w:tcPr>
-            <w:tcW w:w="2141" w:type="dxa"/>
+            <w:tcW w:w="2061" w:type="dxa"/>
             <w:tcBorders/>
             <w:vAlign w:val="center"/>
           </w:tcPr>
@@ -26369,7 +26369,7 @@
         </w:tc>
         <w:tc>
           <w:tcPr>
-            <w:tcW w:w="3130" w:type="dxa"/>
+            <w:tcW w:w="3210" w:type="dxa"/>
             <w:tcBorders/>
             <w:vAlign w:val="center"/>
           </w:tcPr>
@@ -26461,7 +26461,7 @@
         </w:tc>
         <w:tc>
           <w:tcPr>
-            <w:tcW w:w="2141" w:type="dxa"/>
+            <w:tcW w:w="2061" w:type="dxa"/>
             <w:tcBorders/>
             <w:vAlign w:val="center"/>
           </w:tcPr>
@@ -26539,7 +26539,7 @@
         </w:tc>
         <w:tc>
           <w:tcPr>
-            <w:tcW w:w="3130" w:type="dxa"/>
+            <w:tcW w:w="3210" w:type="dxa"/>
             <w:tcBorders/>
             <w:vAlign w:val="center"/>
           </w:tcPr>
@@ -26660,7 +26660,7 @@
         </w:tc>
         <w:tc>
           <w:tcPr>
-            <w:tcW w:w="2141" w:type="dxa"/>
+            <w:tcW w:w="2061" w:type="dxa"/>
             <w:tcBorders/>
             <w:vAlign w:val="center"/>
           </w:tcPr>
@@ -26712,7 +26712,7 @@
         </w:tc>
         <w:tc>
           <w:tcPr>
-            <w:tcW w:w="3130" w:type="dxa"/>
+            <w:tcW w:w="3210" w:type="dxa"/>
             <w:tcBorders/>
             <w:vAlign w:val="center"/>
           </w:tcPr>
@@ -26803,7 +26803,7 @@
         </w:tc>
         <w:tc>
           <w:tcPr>
-            <w:tcW w:w="2141" w:type="dxa"/>
+            <w:tcW w:w="2061" w:type="dxa"/>
             <w:tcBorders/>
             <w:vAlign w:val="center"/>
           </w:tcPr>
@@ -26871,7 +26871,7 @@
         </w:tc>
         <w:tc>
           <w:tcPr>
-            <w:tcW w:w="3130" w:type="dxa"/>
+            <w:tcW w:w="3210" w:type="dxa"/>
             <w:tcBorders/>
             <w:vAlign w:val="center"/>
           </w:tcPr>
@@ -26972,7 +26972,7 @@
         </w:tc>
         <w:tc>
           <w:tcPr>
-            <w:tcW w:w="2141" w:type="dxa"/>
+            <w:tcW w:w="2061" w:type="dxa"/>
             <w:tcBorders/>
             <w:vAlign w:val="center"/>
           </w:tcPr>
@@ -27040,7 +27040,7 @@
         </w:tc>
         <w:tc>
           <w:tcPr>
-            <w:tcW w:w="3130" w:type="dxa"/>
+            <w:tcW w:w="3210" w:type="dxa"/>
             <w:tcBorders/>
             <w:vAlign w:val="center"/>
           </w:tcPr>
@@ -27141,7 +27141,7 @@
         </w:tc>
         <w:tc>
           <w:tcPr>
-            <w:tcW w:w="2141" w:type="dxa"/>
+            <w:tcW w:w="2061" w:type="dxa"/>
             <w:tcBorders/>
             <w:vAlign w:val="center"/>
           </w:tcPr>
@@ -27209,7 +27209,7 @@
         </w:tc>
         <w:tc>
           <w:tcPr>
-            <w:tcW w:w="3130" w:type="dxa"/>
+            <w:tcW w:w="3210" w:type="dxa"/>
             <w:tcBorders/>
             <w:vAlign w:val="center"/>
           </w:tcPr>
@@ -27310,7 +27310,7 @@
         </w:tc>
         <w:tc>
           <w:tcPr>
-            <w:tcW w:w="2141" w:type="dxa"/>
+            <w:tcW w:w="2061" w:type="dxa"/>
             <w:tcBorders/>
             <w:vAlign w:val="center"/>
           </w:tcPr>
@@ -27362,7 +27362,7 @@
         </w:tc>
         <w:tc>
           <w:tcPr>
-            <w:tcW w:w="3130" w:type="dxa"/>
+            <w:tcW w:w="3210" w:type="dxa"/>
             <w:tcBorders/>
             <w:vAlign w:val="center"/>
           </w:tcPr>
@@ -27453,7 +27453,7 @@
         </w:tc>
         <w:tc>
           <w:tcPr>
-            <w:tcW w:w="2141" w:type="dxa"/>
+            <w:tcW w:w="2061" w:type="dxa"/>
             <w:tcBorders/>
             <w:vAlign w:val="center"/>
           </w:tcPr>
@@ -27505,7 +27505,7 @@
         </w:tc>
         <w:tc>
           <w:tcPr>
-            <w:tcW w:w="3130" w:type="dxa"/>
+            <w:tcW w:w="3210" w:type="dxa"/>
             <w:tcBorders/>
             <w:vAlign w:val="center"/>
           </w:tcPr>
@@ -27606,7 +27606,7 @@
         </w:tc>
         <w:tc>
           <w:tcPr>
-            <w:tcW w:w="2141" w:type="dxa"/>
+            <w:tcW w:w="2061" w:type="dxa"/>
             <w:tcBorders/>
             <w:vAlign w:val="center"/>
           </w:tcPr>
@@ -27694,7 +27694,7 @@
         </w:tc>
         <w:tc>
           <w:tcPr>
-            <w:tcW w:w="3130" w:type="dxa"/>
+            <w:tcW w:w="3210" w:type="dxa"/>
             <w:tcBorders/>
             <w:vAlign w:val="center"/>
           </w:tcPr>
@@ -27791,7 +27791,7 @@
         </w:tc>
         <w:tc>
           <w:tcPr>
-            <w:tcW w:w="2141" w:type="dxa"/>
+            <w:tcW w:w="2061" w:type="dxa"/>
             <w:tcBorders/>
             <w:vAlign w:val="center"/>
           </w:tcPr>
@@ -27879,7 +27879,7 @@
         </w:tc>
         <w:tc>
           <w:tcPr>
-            <w:tcW w:w="3130" w:type="dxa"/>
+            <w:tcW w:w="3210" w:type="dxa"/>
             <w:tcBorders/>
             <w:vAlign w:val="center"/>
           </w:tcPr>
@@ -27926,7 +27926,7 @@
               <w:rPr>
                 <w:rStyle w:val="SourceText"/>
               </w:rPr>
-              <w:t>autopilot.ship</w:t>
+              <w:t>autopilot.sleep.deploy</w:t>
             </w:r>
           </w:p>
         </w:tc>
@@ -27970,30 +27970,30 @@
               <w:rPr>
                 <w:rStyle w:val="SourceText"/>
               </w:rPr>
-              <w:t>"merge"</w:t>
-            </w:r>
-          </w:p>
-        </w:tc>
-        <w:tc>
-          <w:tcPr>
-            <w:tcW w:w="2141" w:type="dxa"/>
-            <w:tcBorders/>
-            <w:vAlign w:val="center"/>
-          </w:tcPr>
-          <w:p>
-            <w:pPr>
-              <w:pStyle w:val="TableContents"/>
-              <w:shd w:fill="2E3440" w:val="clear"/>
-              <w:bidi w:val="0"/>
-              <w:spacing w:before="120" w:after="120"/>
-              <w:jc w:val="left"/>
-              <w:rPr/>
-            </w:pPr>
-            <w:r>
-              <w:rPr>
-                <w:rStyle w:val="SourceText"/>
-              </w:rPr>
-              <w:t>pr</w:t>
+              <w:t>null</w:t>
+            </w:r>
+          </w:p>
+        </w:tc>
+        <w:tc>
+          <w:tcPr>
+            <w:tcW w:w="2061" w:type="dxa"/>
+            <w:tcBorders/>
+            <w:vAlign w:val="center"/>
+          </w:tcPr>
+          <w:p>
+            <w:pPr>
+              <w:pStyle w:val="TableContents"/>
+              <w:shd w:fill="2E3440" w:val="clear"/>
+              <w:bidi w:val="0"/>
+              <w:spacing w:before="120" w:after="120"/>
+              <w:jc w:val="left"/>
+              <w:rPr/>
+            </w:pPr>
+            <w:r>
+              <w:rPr>
+                <w:rStyle w:val="SourceText"/>
+              </w:rPr>
+              <w:t>null</w:t>
             </w:r>
             <w:r>
               <w:rPr/>
@@ -28003,7 +28003,31 @@
               <w:rPr>
                 <w:rStyle w:val="SourceText"/>
               </w:rPr>
-              <w:t>merge</w:t>
+              <w:t>nonprod</w:t>
+            </w:r>
+            <w:r>
+              <w:rPr/>
+              <w:t xml:space="preserve"> | </w:t>
+            </w:r>
+            <w:r>
+              <w:rPr>
+                <w:rStyle w:val="SourceText"/>
+              </w:rPr>
+              <w:t>none</w:t>
+            </w:r>
+            <w:r>
+              <w:rPr/>
+              <w:t xml:space="preserve"> (checked in </w:t>
+            </w:r>
+            <w:r>
+              <w:rPr>
+                <w:rStyle w:val="SourceText"/>
+              </w:rPr>
+              <w:t>plugin/crew/hooks/scripts/crew_sleep.py</w:t>
+            </w:r>
+            <w:r>
+              <w:rPr/>
+              <w:t>)</w:t>
             </w:r>
           </w:p>
         </w:tc>
@@ -28024,68 +28048,84 @@
             </w:pPr>
             <w:r>
               <w:rPr/>
-              <w:t>1.0.349</w:t>
-            </w:r>
-          </w:p>
-        </w:tc>
-        <w:tc>
-          <w:tcPr>
-            <w:tcW w:w="3130" w:type="dxa"/>
-            <w:tcBorders/>
-            <w:vAlign w:val="center"/>
-          </w:tcPr>
-          <w:p>
-            <w:pPr>
-              <w:pStyle w:val="TableContents"/>
-              <w:shd w:fill="2E3440" w:val="clear"/>
-              <w:bidi w:val="0"/>
-              <w:spacing w:before="120" w:after="120"/>
-              <w:jc w:val="left"/>
-              <w:rPr/>
-            </w:pPr>
-            <w:r>
-              <w:rPr/>
-              <w:t xml:space="preserve">After </w:t>
-            </w:r>
-            <w:r>
-              <w:rPr>
-                <w:rStyle w:val="SourceText"/>
-              </w:rPr>
-              <w:t>/crew:done</w:t>
-            </w:r>
-            <w:r>
-              <w:rPr/>
-              <w:t xml:space="preserve">: </w:t>
-            </w:r>
-            <w:r>
-              <w:rPr>
-                <w:rStyle w:val="SourceText"/>
-              </w:rPr>
-              <w:t>pr</w:t>
-            </w:r>
-            <w:r>
-              <w:rPr/>
-              <w:t xml:space="preserve"> pushes and opens the PR; </w:t>
-            </w:r>
-            <w:r>
-              <w:rPr>
-                <w:rStyle w:val="SourceText"/>
-              </w:rPr>
-              <w:t>merge</w:t>
-            </w:r>
-            <w:r>
-              <w:rPr/>
-              <w:t xml:space="preserve"> also merges it (a merge commit) once the required checks allow. Anything else reads as </w:t>
-            </w:r>
-            <w:r>
-              <w:rPr>
-                <w:rStyle w:val="SourceText"/>
-              </w:rPr>
-              <w:t>pr</w:t>
-            </w:r>
-            <w:r>
-              <w:rPr/>
-              <w:t>, with a warning.</w:t>
+              <w:t>1.1.24</w:t>
+            </w:r>
+          </w:p>
+        </w:tc>
+        <w:tc>
+          <w:tcPr>
+            <w:tcW w:w="3210" w:type="dxa"/>
+            <w:tcBorders/>
+            <w:vAlign w:val="center"/>
+          </w:tcPr>
+          <w:p>
+            <w:pPr>
+              <w:pStyle w:val="TableContents"/>
+              <w:shd w:fill="2E3440" w:val="clear"/>
+              <w:bidi w:val="0"/>
+              <w:spacing w:before="120" w:after="120"/>
+              <w:jc w:val="left"/>
+              <w:rPr/>
+            </w:pPr>
+            <w:r>
+              <w:rPr>
+                <w:rStyle w:val="SourceText"/>
+              </w:rPr>
+              <w:t>autopilot.deploy</w:t>
+            </w:r>
+            <w:r>
+              <w:rPr/>
+              <w:t xml:space="preserve"> inside the sleep window (L-0654): null keeps the day value, </w:t>
+            </w:r>
+            <w:r>
+              <w:rPr>
+                <w:rStyle w:val="SourceText"/>
+              </w:rPr>
+              <w:t>nonprod</w:t>
+            </w:r>
+            <w:r>
+              <w:rPr/>
+              <w:t xml:space="preserve"> or </w:t>
+            </w:r>
+            <w:r>
+              <w:rPr>
+                <w:rStyle w:val="SourceText"/>
+              </w:rPr>
+              <w:t>none</w:t>
+            </w:r>
+            <w:r>
+              <w:rPr/>
+              <w:t xml:space="preserve"> replaces it; anything else, </w:t>
+            </w:r>
+            <w:r>
+              <w:rPr>
+                <w:rStyle w:val="SourceText"/>
+              </w:rPr>
+              <w:t>all</w:t>
+            </w:r>
+            <w:r>
+              <w:rPr/>
+              <w:t xml:space="preserve"> included, is refused with a warning. Asleep, an effective </w:t>
+            </w:r>
+            <w:r>
+              <w:rPr>
+                <w:rStyle w:val="SourceText"/>
+              </w:rPr>
+              <w:t>all</w:t>
+            </w:r>
+            <w:r>
+              <w:rPr/>
+              <w:t xml:space="preserve"> reads as </w:t>
+            </w:r>
+            <w:r>
+              <w:rPr>
+                <w:rStyle w:val="SourceText"/>
+              </w:rPr>
+              <w:t>nonprod</w:t>
+            </w:r>
+            <w:r>
+              <w:rPr/>
+              <w:t>: production never runs unattended asleep.</w:t>
             </w:r>
           </w:p>
         </w:tc>
@@ -28111,7 +28151,7 @@
               <w:rPr>
                 <w:rStyle w:val="SourceText"/>
               </w:rPr>
-              <w:t>autopilot.knownFailures</w:t>
+              <w:t>autopilot.ship</w:t>
             </w:r>
           </w:p>
         </w:tc>
@@ -28155,38 +28195,40 @@
               <w:rPr>
                 <w:rStyle w:val="SourceText"/>
               </w:rPr>
-              <w:t>[]</w:t>
-            </w:r>
-          </w:p>
-        </w:tc>
-        <w:tc>
-          <w:tcPr>
-            <w:tcW w:w="2141" w:type="dxa"/>
-            <w:tcBorders/>
-            <w:vAlign w:val="center"/>
-          </w:tcPr>
-          <w:p>
-            <w:pPr>
-              <w:pStyle w:val="TableContents"/>
-              <w:shd w:fill="2E3440" w:val="clear"/>
-              <w:bidi w:val="0"/>
-              <w:spacing w:before="120" w:after="120"/>
-              <w:jc w:val="left"/>
-              <w:rPr/>
-            </w:pPr>
-            <w:r>
-              <w:rPr/>
-              <w:t xml:space="preserve">list of check names (checked in </w:t>
-            </w:r>
-            <w:r>
-              <w:rPr>
-                <w:rStyle w:val="SourceText"/>
-              </w:rPr>
-              <w:t>plugin/crew/hooks/scripts/crew_autopilot.py</w:t>
-            </w:r>
-            <w:r>
-              <w:rPr/>
-              <w:t>)</w:t>
+              <w:t>"merge"</w:t>
+            </w:r>
+          </w:p>
+        </w:tc>
+        <w:tc>
+          <w:tcPr>
+            <w:tcW w:w="2061" w:type="dxa"/>
+            <w:tcBorders/>
+            <w:vAlign w:val="center"/>
+          </w:tcPr>
+          <w:p>
+            <w:pPr>
+              <w:pStyle w:val="TableContents"/>
+              <w:shd w:fill="2E3440" w:val="clear"/>
+              <w:bidi w:val="0"/>
+              <w:spacing w:before="120" w:after="120"/>
+              <w:jc w:val="left"/>
+              <w:rPr/>
+            </w:pPr>
+            <w:r>
+              <w:rPr>
+                <w:rStyle w:val="SourceText"/>
+              </w:rPr>
+              <w:t>pr</w:t>
+            </w:r>
+            <w:r>
+              <w:rPr/>
+              <w:t xml:space="preserve"> | </w:t>
+            </w:r>
+            <w:r>
+              <w:rPr>
+                <w:rStyle w:val="SourceText"/>
+              </w:rPr>
+              <w:t>merge</w:t>
             </w:r>
           </w:p>
         </w:tc>
@@ -28213,38 +28255,58 @@
         </w:tc>
         <w:tc>
           <w:tcPr>
-            <w:tcW w:w="3130" w:type="dxa"/>
-            <w:tcBorders/>
-            <w:vAlign w:val="center"/>
-          </w:tcPr>
-          <w:p>
-            <w:pPr>
-              <w:pStyle w:val="TableContents"/>
-              <w:shd w:fill="2E3440" w:val="clear"/>
-              <w:bidi w:val="0"/>
-              <w:spacing w:before="120" w:after="120"/>
-              <w:jc w:val="left"/>
-              <w:rPr/>
-            </w:pPr>
-            <w:r>
-              <w:rPr/>
-              <w:t xml:space="preserve">Required checks whose </w:t>
-            </w:r>
-            <w:r>
-              <w:rPr>
-                <w:rStyle w:val="SourceText"/>
-              </w:rPr>
-              <w:t>fail</w:t>
-            </w:r>
-            <w:r>
-              <w:rPr/>
-              <w:t xml:space="preserve"> does not block a merge, matched by exact name; anything but a list of strings reads as </w:t>
-            </w:r>
-            <w:r>
-              <w:rPr>
-                <w:rStyle w:val="SourceText"/>
-              </w:rPr>
-              <w:t>[]</w:t>
+            <w:tcW w:w="3210" w:type="dxa"/>
+            <w:tcBorders/>
+            <w:vAlign w:val="center"/>
+          </w:tcPr>
+          <w:p>
+            <w:pPr>
+              <w:pStyle w:val="TableContents"/>
+              <w:shd w:fill="2E3440" w:val="clear"/>
+              <w:bidi w:val="0"/>
+              <w:spacing w:before="120" w:after="120"/>
+              <w:jc w:val="left"/>
+              <w:rPr/>
+            </w:pPr>
+            <w:r>
+              <w:rPr/>
+              <w:t xml:space="preserve">After </w:t>
+            </w:r>
+            <w:r>
+              <w:rPr>
+                <w:rStyle w:val="SourceText"/>
+              </w:rPr>
+              <w:t>/crew:done</w:t>
+            </w:r>
+            <w:r>
+              <w:rPr/>
+              <w:t xml:space="preserve">: </w:t>
+            </w:r>
+            <w:r>
+              <w:rPr>
+                <w:rStyle w:val="SourceText"/>
+              </w:rPr>
+              <w:t>pr</w:t>
+            </w:r>
+            <w:r>
+              <w:rPr/>
+              <w:t xml:space="preserve"> pushes and opens the PR; </w:t>
+            </w:r>
+            <w:r>
+              <w:rPr>
+                <w:rStyle w:val="SourceText"/>
+              </w:rPr>
+              <w:t>merge</w:t>
+            </w:r>
+            <w:r>
+              <w:rPr/>
+              <w:t xml:space="preserve"> also merges it (a merge commit) once the required checks allow. Anything else reads as </w:t>
+            </w:r>
+            <w:r>
+              <w:rPr>
+                <w:rStyle w:val="SourceText"/>
+              </w:rPr>
+              <w:t>pr</w:t>
             </w:r>
             <w:r>
               <w:rPr/>
@@ -28274,7 +28336,7 @@
               <w:rPr>
                 <w:rStyle w:val="SourceText"/>
               </w:rPr>
-              <w:t>autopilot.ciTimeoutMinutes</w:t>
+              <w:t>autopilot.knownFailures</w:t>
             </w:r>
           </w:p>
         </w:tc>
@@ -28318,28 +28380,28 @@
               <w:rPr>
                 <w:rStyle w:val="SourceText"/>
               </w:rPr>
-              <w:t>60</w:t>
-            </w:r>
-          </w:p>
-        </w:tc>
-        <w:tc>
-          <w:tcPr>
-            <w:tcW w:w="2141" w:type="dxa"/>
-            <w:tcBorders/>
-            <w:vAlign w:val="center"/>
-          </w:tcPr>
-          <w:p>
-            <w:pPr>
-              <w:pStyle w:val="TableContents"/>
-              <w:shd w:fill="2E3440" w:val="clear"/>
-              <w:bidi w:val="0"/>
-              <w:spacing w:before="120" w:after="120"/>
-              <w:jc w:val="left"/>
-              <w:rPr/>
-            </w:pPr>
-            <w:r>
-              <w:rPr/>
-              <w:t xml:space="preserve">positive integer (checked in </w:t>
+              <w:t>[]</w:t>
+            </w:r>
+          </w:p>
+        </w:tc>
+        <w:tc>
+          <w:tcPr>
+            <w:tcW w:w="2061" w:type="dxa"/>
+            <w:tcBorders/>
+            <w:vAlign w:val="center"/>
+          </w:tcPr>
+          <w:p>
+            <w:pPr>
+              <w:pStyle w:val="TableContents"/>
+              <w:shd w:fill="2E3440" w:val="clear"/>
+              <w:bidi w:val="0"/>
+              <w:spacing w:before="120" w:after="120"/>
+              <w:jc w:val="left"/>
+              <w:rPr/>
+            </w:pPr>
+            <w:r>
+              <w:rPr/>
+              <w:t xml:space="preserve">list of check names (checked in </w:t>
             </w:r>
             <w:r>
               <w:rPr>
@@ -28376,32 +28438,42 @@
         </w:tc>
         <w:tc>
           <w:tcPr>
-            <w:tcW w:w="3130" w:type="dxa"/>
-            <w:tcBorders/>
-            <w:vAlign w:val="center"/>
-          </w:tcPr>
-          <w:p>
-            <w:pPr>
-              <w:pStyle w:val="TableContents"/>
-              <w:shd w:fill="2E3440" w:val="clear"/>
-              <w:bidi w:val="0"/>
-              <w:spacing w:before="120" w:after="120"/>
-              <w:jc w:val="left"/>
-              <w:rPr/>
-            </w:pPr>
-            <w:r>
-              <w:rPr/>
-              <w:t xml:space="preserve">Minutes </w:t>
-            </w:r>
-            <w:r>
-              <w:rPr>
-                <w:rStyle w:val="SourceText"/>
-              </w:rPr>
-              <w:t>ship</w:t>
-            </w:r>
-            <w:r>
-              <w:rPr/>
-              <w:t xml:space="preserve"> waits for the required checks; still pending, or green only after it, stops. Anything but a positive integer reads as 60, with a warning.</w:t>
+            <w:tcW w:w="3210" w:type="dxa"/>
+            <w:tcBorders/>
+            <w:vAlign w:val="center"/>
+          </w:tcPr>
+          <w:p>
+            <w:pPr>
+              <w:pStyle w:val="TableContents"/>
+              <w:shd w:fill="2E3440" w:val="clear"/>
+              <w:bidi w:val="0"/>
+              <w:spacing w:before="120" w:after="120"/>
+              <w:jc w:val="left"/>
+              <w:rPr/>
+            </w:pPr>
+            <w:r>
+              <w:rPr/>
+              <w:t xml:space="preserve">Required checks whose </w:t>
+            </w:r>
+            <w:r>
+              <w:rPr>
+                <w:rStyle w:val="SourceText"/>
+              </w:rPr>
+              <w:t>fail</w:t>
+            </w:r>
+            <w:r>
+              <w:rPr/>
+              <w:t xml:space="preserve"> does not block a merge, matched by exact name; anything but a list of strings reads as </w:t>
+            </w:r>
+            <w:r>
+              <w:rPr>
+                <w:rStyle w:val="SourceText"/>
+              </w:rPr>
+              <w:t>[]</w:t>
+            </w:r>
+            <w:r>
+              <w:rPr/>
+              <w:t>, with a warning.</w:t>
             </w:r>
           </w:p>
         </w:tc>
@@ -28427,7 +28499,7 @@
               <w:rPr>
                 <w:rStyle w:val="SourceText"/>
               </w:rPr>
-              <w:t>autopilot.maxTicketsPerRun</w:t>
+              <w:t>autopilot.ciTimeoutMinutes</w:t>
             </w:r>
           </w:p>
         </w:tc>
@@ -28471,13 +28543,13 @@
               <w:rPr>
                 <w:rStyle w:val="SourceText"/>
               </w:rPr>
-              <w:t>3</w:t>
-            </w:r>
-          </w:p>
-        </w:tc>
-        <w:tc>
-          <w:tcPr>
-            <w:tcW w:w="2141" w:type="dxa"/>
+              <w:t>60</w:t>
+            </w:r>
+          </w:p>
+        </w:tc>
+        <w:tc>
+          <w:tcPr>
+            <w:tcW w:w="2061" w:type="dxa"/>
             <w:tcBorders/>
             <w:vAlign w:val="center"/>
           </w:tcPr>
@@ -28498,7 +28570,7 @@
               <w:rPr>
                 <w:rStyle w:val="SourceText"/>
               </w:rPr>
-              <w:t>plugin/crew/hooks/scripts/crew_autopilot_backlog.py</w:t>
+              <w:t>plugin/crew/hooks/scripts/crew_autopilot.py</w:t>
             </w:r>
             <w:r>
               <w:rPr/>
@@ -28523,28 +28595,38 @@
             </w:pPr>
             <w:r>
               <w:rPr/>
-              <w:t>1.1.23</w:t>
-            </w:r>
-          </w:p>
-        </w:tc>
-        <w:tc>
-          <w:tcPr>
-            <w:tcW w:w="3130" w:type="dxa"/>
-            <w:tcBorders/>
-            <w:vAlign w:val="center"/>
-          </w:tcPr>
-          <w:p>
-            <w:pPr>
-              <w:pStyle w:val="TableContents"/>
-              <w:shd w:fill="2E3440" w:val="clear"/>
-              <w:bidi w:val="0"/>
-              <w:spacing w:before="120" w:after="120"/>
-              <w:jc w:val="left"/>
-              <w:rPr/>
-            </w:pPr>
-            <w:r>
-              <w:rPr/>
-              <w:t>Tickets one goal run (one session) may start; the next one stops the run. Anything but a positive integer reads as 3, with a warning.</w:t>
+              <w:t>1.0.349</w:t>
+            </w:r>
+          </w:p>
+        </w:tc>
+        <w:tc>
+          <w:tcPr>
+            <w:tcW w:w="3210" w:type="dxa"/>
+            <w:tcBorders/>
+            <w:vAlign w:val="center"/>
+          </w:tcPr>
+          <w:p>
+            <w:pPr>
+              <w:pStyle w:val="TableContents"/>
+              <w:shd w:fill="2E3440" w:val="clear"/>
+              <w:bidi w:val="0"/>
+              <w:spacing w:before="120" w:after="120"/>
+              <w:jc w:val="left"/>
+              <w:rPr/>
+            </w:pPr>
+            <w:r>
+              <w:rPr/>
+              <w:t xml:space="preserve">Minutes </w:t>
+            </w:r>
+            <w:r>
+              <w:rPr>
+                <w:rStyle w:val="SourceText"/>
+              </w:rPr>
+              <w:t>ship</w:t>
+            </w:r>
+            <w:r>
+              <w:rPr/>
+              <w:t xml:space="preserve"> waits for the required checks; still pending, or green only after it, stops. Anything but a positive integer reads as 60, with a warning.</w:t>
             </w:r>
           </w:p>
         </w:tc>
@@ -28570,6 +28652,149 @@
               <w:rPr>
                 <w:rStyle w:val="SourceText"/>
               </w:rPr>
+              <w:t>autopilot.maxTicketsPerRun</w:t>
+            </w:r>
+          </w:p>
+        </w:tc>
+        <w:tc>
+          <w:tcPr>
+            <w:tcW w:w="1134" w:type="dxa"/>
+            <w:tcBorders/>
+            <w:vAlign w:val="center"/>
+          </w:tcPr>
+          <w:p>
+            <w:pPr>
+              <w:pStyle w:val="TableContents"/>
+              <w:shd w:fill="2E3440" w:val="clear"/>
+              <w:bidi w:val="0"/>
+              <w:spacing w:before="120" w:after="120"/>
+              <w:jc w:val="left"/>
+              <w:rPr/>
+            </w:pPr>
+            <w:r>
+              <w:rPr/>
+              <w:t>repo</w:t>
+            </w:r>
+          </w:p>
+        </w:tc>
+        <w:tc>
+          <w:tcPr>
+            <w:tcW w:w="1156" w:type="dxa"/>
+            <w:tcBorders/>
+            <w:vAlign w:val="center"/>
+          </w:tcPr>
+          <w:p>
+            <w:pPr>
+              <w:pStyle w:val="TableContents"/>
+              <w:shd w:fill="2E3440" w:val="clear"/>
+              <w:bidi w:val="0"/>
+              <w:spacing w:before="120" w:after="120"/>
+              <w:jc w:val="left"/>
+              <w:rPr/>
+            </w:pPr>
+            <w:r>
+              <w:rPr>
+                <w:rStyle w:val="SourceText"/>
+              </w:rPr>
+              <w:t>3</w:t>
+            </w:r>
+          </w:p>
+        </w:tc>
+        <w:tc>
+          <w:tcPr>
+            <w:tcW w:w="2061" w:type="dxa"/>
+            <w:tcBorders/>
+            <w:vAlign w:val="center"/>
+          </w:tcPr>
+          <w:p>
+            <w:pPr>
+              <w:pStyle w:val="TableContents"/>
+              <w:shd w:fill="2E3440" w:val="clear"/>
+              <w:bidi w:val="0"/>
+              <w:spacing w:before="120" w:after="120"/>
+              <w:jc w:val="left"/>
+              <w:rPr/>
+            </w:pPr>
+            <w:r>
+              <w:rPr/>
+              <w:t xml:space="preserve">positive integer (checked in </w:t>
+            </w:r>
+            <w:r>
+              <w:rPr>
+                <w:rStyle w:val="SourceText"/>
+              </w:rPr>
+              <w:t>plugin/crew/hooks/scripts/crew_autopilot_backlog.py</w:t>
+            </w:r>
+            <w:r>
+              <w:rPr/>
+              <w:t>)</w:t>
+            </w:r>
+          </w:p>
+        </w:tc>
+        <w:tc>
+          <w:tcPr>
+            <w:tcW w:w="1242" w:type="dxa"/>
+            <w:tcBorders/>
+            <w:vAlign w:val="center"/>
+          </w:tcPr>
+          <w:p>
+            <w:pPr>
+              <w:pStyle w:val="TableContents"/>
+              <w:shd w:fill="2E3440" w:val="clear"/>
+              <w:bidi w:val="0"/>
+              <w:spacing w:before="120" w:after="120"/>
+              <w:jc w:val="left"/>
+              <w:rPr/>
+            </w:pPr>
+            <w:r>
+              <w:rPr/>
+              <w:t>1.1.23</w:t>
+            </w:r>
+          </w:p>
+        </w:tc>
+        <w:tc>
+          <w:tcPr>
+            <w:tcW w:w="3210" w:type="dxa"/>
+            <w:tcBorders/>
+            <w:vAlign w:val="center"/>
+          </w:tcPr>
+          <w:p>
+            <w:pPr>
+              <w:pStyle w:val="TableContents"/>
+              <w:shd w:fill="2E3440" w:val="clear"/>
+              <w:bidi w:val="0"/>
+              <w:spacing w:before="120" w:after="120"/>
+              <w:jc w:val="left"/>
+              <w:rPr/>
+            </w:pPr>
+            <w:r>
+              <w:rPr/>
+              <w:t>Tickets one goal run (one session) may start; the next one stops the run. Anything but a positive integer reads as 3, with a warning.</w:t>
+            </w:r>
+          </w:p>
+        </w:tc>
+      </w:tr>
+      <w:tr>
+        <w:trPr/>
+        <w:tc>
+          <w:tcPr>
+            <w:tcW w:w="3968" w:type="dxa"/>
+            <w:tcBorders/>
+            <w:vAlign w:val="center"/>
+          </w:tcPr>
+          <w:p>
+            <w:pPr>
+              <w:pStyle w:val="TableContents"/>
+              <w:shd w:fill="2E3440" w:val="clear"/>
+              <w:bidi w:val="0"/>
+              <w:spacing w:before="120" w:after="120"/>
+              <w:jc w:val="left"/>
+              <w:rPr/>
+            </w:pPr>
+            <w:r>
+              <w:rPr>
+                <w:rStyle w:val="SourceText"/>
+              </w:rPr>
               <w:t>autopilot.maxTokensPerSession</w:t>
             </w:r>
           </w:p>
@@ -28620,7 +28845,7 @@
         </w:tc>
         <w:tc>
           <w:tcPr>
-            <w:tcW w:w="2141" w:type="dxa"/>
+            <w:tcW w:w="2061" w:type="dxa"/>
             <w:tcBorders/>
             <w:vAlign w:val="center"/>
           </w:tcPr>
@@ -28672,7 +28897,7 @@
         </w:tc>
         <w:tc>
           <w:tcPr>
-            <w:tcW w:w="3130" w:type="dxa"/>
+            <w:tcW w:w="3210" w:type="dxa"/>
             <w:tcBorders/>
             <w:vAlign w:val="center"/>
           </w:tcPr>

</xml_diff>

<commit_message>
crew 1.1.21: version for group g6b-goals-sleep landing into release/1.2.0 (L-0541, T-0056, L-0658, L-0659, L-0654, L-0653, L-0656)
The four G6b settings (autopilot.sleep.deploy, autopilot.sleep.notifyHold,
autopilot.maxTicketsPerRun, autopilot.maxTokensPerSession) now record 1.1.21
as the version they arrived in, not the 1.1.16 placeholder: release already
shipped a 1.1.16 without them. The configuration reference is regenerated.
This rides the version commit because a key's version may not be later than
the installed one.

Claude-Session: https://claude.ai/code/session_01H49aKnVMcvefcadqBGmuMu
</commit_message>
<xml_diff>
--- a/docs/guides/crew/crew-configuration-reference.docx
+++ b/docs/guides/crew/crew-configuration-reference.docx
@@ -29044,7 +29044,7 @@
             </w:pPr>
             <w:r>
               <w:rPr/>
-              <w:t>1.1.16</w:t>
+              <w:t>1.1.21</w:t>
             </w:r>
           </w:p>
         </w:tc>
@@ -29259,7 +29259,7 @@
             </w:pPr>
             <w:r>
               <w:rPr/>
-              <w:t>1.1.16</w:t>
+              <w:t>1.1.21</w:t>
             </w:r>
           </w:p>
         </w:tc>
@@ -29412,7 +29412,7 @@
             </w:pPr>
             <w:r>
               <w:rPr/>
-              <w:t>1.1.16</w:t>
+              <w:t>1.1.21</w:t>
             </w:r>
           </w:p>
         </w:tc>
@@ -29555,7 +29555,7 @@
             </w:pPr>
             <w:r>
               <w:rPr/>
-              <w:t>1.1.16</w:t>
+              <w:t>1.1.21</w:t>
             </w:r>
           </w:p>
         </w:tc>

</xml_diff>

<commit_message>
Revert the crew 1.1.21 version commit so it can be re-applied last
Claude-Session: https://claude.ai/code/session_01H49aKnVMcvefcadqBGmuMu
</commit_message>
<xml_diff>
--- a/docs/guides/crew/crew-configuration-reference.docx
+++ b/docs/guides/crew/crew-configuration-reference.docx
@@ -29044,7 +29044,7 @@
             </w:pPr>
             <w:r>
               <w:rPr/>
-              <w:t>1.1.21</w:t>
+              <w:t>1.1.16</w:t>
             </w:r>
           </w:p>
         </w:tc>
@@ -29259,7 +29259,7 @@
             </w:pPr>
             <w:r>
               <w:rPr/>
-              <w:t>1.1.21</w:t>
+              <w:t>1.1.16</w:t>
             </w:r>
           </w:p>
         </w:tc>
@@ -29412,7 +29412,7 @@
             </w:pPr>
             <w:r>
               <w:rPr/>
-              <w:t>1.1.21</w:t>
+              <w:t>1.1.16</w:t>
             </w:r>
           </w:p>
         </w:tc>
@@ -29555,7 +29555,7 @@
             </w:pPr>
             <w:r>
               <w:rPr/>
-              <w:t>1.1.21</w:t>
+              <w:t>1.1.16</w:t>
             </w:r>
           </w:p>
         </w:tc>

</xml_diff>

<commit_message>
L-0805: crew 1.2.40: context.warnAt default 0.5 -> 0.4 (auto wrap-up and auto-clear at 40%)
</commit_message>
<xml_diff>
--- a/docs/guides/crew/crew-configuration-reference.docx
+++ b/docs/guides/crew/crew-configuration-reference.docx
@@ -10304,7 +10304,7 @@
               <w:rPr>
                 <w:rStyle w:val="SourceText"/>
               </w:rPr>
-              <w:t>0.5</w:t>
+              <w:t>0.4</w:t>
             </w:r>
           </w:p>
         </w:tc>
@@ -10377,7 +10377,7 @@
             </w:pPr>
             <w:r>
               <w:rPr/>
-              <w:t>Fraction of the budget at which the watcher warns.</w:t>
+              <w:t>Fraction of the budget at which the watcher warns, wraps up and auto-clears; default 0.4 since 1.2.40 (was 0.5), an explicit value is kept.</w:t>
             </w:r>
           </w:p>
         </w:tc>
@@ -23225,7 +23225,7 @@
             </w:pPr>
             <w:r>
               <w:rPr/>
-              <w:t>1.2.24</w:t>
+              <w:t>1.2.26</w:t>
             </w:r>
           </w:p>
         </w:tc>

</xml_diff>

<commit_message>
L-0867: rebuild guides, BUDGETS line count
</commit_message>
<xml_diff>
--- a/docs/guides/crew/crew-configuration-reference.docx
+++ b/docs/guides/crew/crew-configuration-reference.docx
@@ -9955,9 +9955,9 @@
         <w:gridCol w:w="4654"/>
         <w:gridCol w:w="1784"/>
         <w:gridCol w:w="1402"/>
-        <w:gridCol w:w="2340"/>
+        <w:gridCol w:w="2331"/>
         <w:gridCol w:w="1025"/>
-        <w:gridCol w:w="1913"/>
+        <w:gridCol w:w="1922"/>
       </w:tblGrid>
       <w:tr>
         <w:trPr>
@@ -10031,7 +10031,7 @@
         </w:tc>
         <w:tc>
           <w:tcPr>
-            <w:tcW w:w="2340" w:type="dxa"/>
+            <w:tcW w:w="2331" w:type="dxa"/>
             <w:tcBorders/>
             <w:vAlign w:val="center"/>
           </w:tcPr>
@@ -10075,7 +10075,7 @@
         </w:tc>
         <w:tc>
           <w:tcPr>
-            <w:tcW w:w="1913" w:type="dxa"/>
+            <w:tcW w:w="1922" w:type="dxa"/>
             <w:tcBorders/>
             <w:vAlign w:val="center"/>
           </w:tcPr>
@@ -10167,7 +10167,7 @@
         </w:tc>
         <w:tc>
           <w:tcPr>
-            <w:tcW w:w="2340" w:type="dxa"/>
+            <w:tcW w:w="2331" w:type="dxa"/>
             <w:tcBorders/>
             <w:vAlign w:val="center"/>
           </w:tcPr>
@@ -10219,7 +10219,7 @@
         </w:tc>
         <w:tc>
           <w:tcPr>
-            <w:tcW w:w="1913" w:type="dxa"/>
+            <w:tcW w:w="1922" w:type="dxa"/>
             <w:tcBorders/>
             <w:vAlign w:val="center"/>
           </w:tcPr>
@@ -10310,7 +10310,7 @@
         </w:tc>
         <w:tc>
           <w:tcPr>
-            <w:tcW w:w="2340" w:type="dxa"/>
+            <w:tcW w:w="2331" w:type="dxa"/>
             <w:tcBorders/>
             <w:vAlign w:val="center"/>
           </w:tcPr>
@@ -10362,7 +10362,7 @@
         </w:tc>
         <w:tc>
           <w:tcPr>
-            <w:tcW w:w="1913" w:type="dxa"/>
+            <w:tcW w:w="1922" w:type="dxa"/>
             <w:tcBorders/>
             <w:vAlign w:val="center"/>
           </w:tcPr>
@@ -10453,7 +10453,7 @@
         </w:tc>
         <w:tc>
           <w:tcPr>
-            <w:tcW w:w="2340" w:type="dxa"/>
+            <w:tcW w:w="2331" w:type="dxa"/>
             <w:tcBorders/>
             <w:vAlign w:val="center"/>
           </w:tcPr>
@@ -10505,7 +10505,7 @@
         </w:tc>
         <w:tc>
           <w:tcPr>
-            <w:tcW w:w="1913" w:type="dxa"/>
+            <w:tcW w:w="1922" w:type="dxa"/>
             <w:tcBorders/>
             <w:vAlign w:val="center"/>
           </w:tcPr>
@@ -10596,7 +10596,7 @@
         </w:tc>
         <w:tc>
           <w:tcPr>
-            <w:tcW w:w="2340" w:type="dxa"/>
+            <w:tcW w:w="2331" w:type="dxa"/>
             <w:tcBorders/>
             <w:vAlign w:val="center"/>
           </w:tcPr>
@@ -10648,7 +10648,7 @@
         </w:tc>
         <w:tc>
           <w:tcPr>
-            <w:tcW w:w="1913" w:type="dxa"/>
+            <w:tcW w:w="1922" w:type="dxa"/>
             <w:tcBorders/>
             <w:vAlign w:val="center"/>
           </w:tcPr>
@@ -10749,7 +10749,7 @@
         </w:tc>
         <w:tc>
           <w:tcPr>
-            <w:tcW w:w="2340" w:type="dxa"/>
+            <w:tcW w:w="2331" w:type="dxa"/>
             <w:tcBorders/>
             <w:vAlign w:val="center"/>
           </w:tcPr>
@@ -10801,7 +10801,7 @@
         </w:tc>
         <w:tc>
           <w:tcPr>
-            <w:tcW w:w="1913" w:type="dxa"/>
+            <w:tcW w:w="1922" w:type="dxa"/>
             <w:tcBorders/>
             <w:vAlign w:val="center"/>
           </w:tcPr>
@@ -10892,7 +10892,7 @@
         </w:tc>
         <w:tc>
           <w:tcPr>
-            <w:tcW w:w="2340" w:type="dxa"/>
+            <w:tcW w:w="2331" w:type="dxa"/>
             <w:tcBorders/>
             <w:vAlign w:val="center"/>
           </w:tcPr>
@@ -10944,7 +10944,7 @@
         </w:tc>
         <w:tc>
           <w:tcPr>
-            <w:tcW w:w="1913" w:type="dxa"/>
+            <w:tcW w:w="1922" w:type="dxa"/>
             <w:tcBorders/>
             <w:vAlign w:val="center"/>
           </w:tcPr>
@@ -11035,7 +11035,7 @@
         </w:tc>
         <w:tc>
           <w:tcPr>
-            <w:tcW w:w="2340" w:type="dxa"/>
+            <w:tcW w:w="2331" w:type="dxa"/>
             <w:tcBorders/>
             <w:vAlign w:val="center"/>
           </w:tcPr>
@@ -11113,7 +11113,7 @@
         </w:tc>
         <w:tc>
           <w:tcPr>
-            <w:tcW w:w="1913" w:type="dxa"/>
+            <w:tcW w:w="1922" w:type="dxa"/>
             <w:tcBorders/>
             <w:vAlign w:val="center"/>
           </w:tcPr>
@@ -11224,7 +11224,7 @@
         </w:tc>
         <w:tc>
           <w:tcPr>
-            <w:tcW w:w="2340" w:type="dxa"/>
+            <w:tcW w:w="2331" w:type="dxa"/>
             <w:tcBorders/>
             <w:vAlign w:val="center"/>
           </w:tcPr>
@@ -11295,17 +11295,7 @@
             </w:r>
             <w:r>
               <w:rPr/>
-              <w:t xml:space="preserve"> | </w:t>
-            </w:r>
-            <w:r>
-              <w:rPr>
-                <w:rStyle w:val="SourceText"/>
-              </w:rPr>
-              <w:t>sendkeys</w:t>
-            </w:r>
-            <w:r>
-              <w:rPr/>
-              <w:t>; per OS: linux: auto, none, notify, tmux, xdotool, wtype; macos: auto, none, notify, tmux; windows: auto, none, notify, sendkeys; windows-bash: auto, none, notify, tmux, sendkeys</w:t>
+              <w:t>; per OS: linux: auto, none, notify, tmux, xdotool, wtype; macos: auto, none, notify, tmux; windows: auto, none, notify; windows-bash: auto, none, notify, tmux</w:t>
             </w:r>
           </w:p>
         </w:tc>
@@ -11332,7 +11322,7 @@
         </w:tc>
         <w:tc>
           <w:tcPr>
-            <w:tcW w:w="1913" w:type="dxa"/>
+            <w:tcW w:w="1922" w:type="dxa"/>
             <w:tcBorders/>
             <w:vAlign w:val="center"/>
           </w:tcPr>
@@ -11443,7 +11433,7 @@
         </w:tc>
         <w:tc>
           <w:tcPr>
-            <w:tcW w:w="2340" w:type="dxa"/>
+            <w:tcW w:w="2331" w:type="dxa"/>
             <w:tcBorders/>
             <w:vAlign w:val="center"/>
           </w:tcPr>
@@ -11464,7 +11454,7 @@
               <w:rPr>
                 <w:rStyle w:val="SourceText"/>
               </w:rPr>
-              <w:t>plugin/crew/hooks/scripts/auto-clear.ps1</w:t>
+              <w:t>plugin/crew/hooks/scripts/crew_autocycle.py</w:t>
             </w:r>
             <w:r>
               <w:rPr/>
@@ -11495,7 +11485,7 @@
         </w:tc>
         <w:tc>
           <w:tcPr>
-            <w:tcW w:w="1913" w:type="dxa"/>
+            <w:tcW w:w="1922" w:type="dxa"/>
             <w:tcBorders/>
             <w:vAlign w:val="center"/>
           </w:tcPr>
@@ -11586,7 +11576,7 @@
         </w:tc>
         <w:tc>
           <w:tcPr>
-            <w:tcW w:w="2340" w:type="dxa"/>
+            <w:tcW w:w="2331" w:type="dxa"/>
             <w:tcBorders/>
             <w:vAlign w:val="center"/>
           </w:tcPr>
@@ -11638,7 +11628,7 @@
         </w:tc>
         <w:tc>
           <w:tcPr>
-            <w:tcW w:w="1913" w:type="dxa"/>
+            <w:tcW w:w="1922" w:type="dxa"/>
             <w:tcBorders/>
             <w:vAlign w:val="center"/>
           </w:tcPr>
@@ -11729,7 +11719,7 @@
         </w:tc>
         <w:tc>
           <w:tcPr>
-            <w:tcW w:w="2340" w:type="dxa"/>
+            <w:tcW w:w="2331" w:type="dxa"/>
             <w:tcBorders/>
             <w:vAlign w:val="center"/>
           </w:tcPr>
@@ -11781,7 +11771,7 @@
         </w:tc>
         <w:tc>
           <w:tcPr>
-            <w:tcW w:w="1913" w:type="dxa"/>
+            <w:tcW w:w="1922" w:type="dxa"/>
             <w:tcBorders/>
             <w:vAlign w:val="center"/>
           </w:tcPr>
@@ -11872,7 +11862,7 @@
         </w:tc>
         <w:tc>
           <w:tcPr>
-            <w:tcW w:w="2340" w:type="dxa"/>
+            <w:tcW w:w="2331" w:type="dxa"/>
             <w:tcBorders/>
             <w:vAlign w:val="center"/>
           </w:tcPr>
@@ -11924,7 +11914,7 @@
         </w:tc>
         <w:tc>
           <w:tcPr>
-            <w:tcW w:w="1913" w:type="dxa"/>
+            <w:tcW w:w="1922" w:type="dxa"/>
             <w:tcBorders/>
             <w:vAlign w:val="center"/>
           </w:tcPr>
@@ -12015,7 +12005,7 @@
         </w:tc>
         <w:tc>
           <w:tcPr>
-            <w:tcW w:w="2340" w:type="dxa"/>
+            <w:tcW w:w="2331" w:type="dxa"/>
             <w:tcBorders/>
             <w:vAlign w:val="center"/>
           </w:tcPr>
@@ -12067,7 +12057,7 @@
         </w:tc>
         <w:tc>
           <w:tcPr>
-            <w:tcW w:w="1913" w:type="dxa"/>
+            <w:tcW w:w="1922" w:type="dxa"/>
             <w:tcBorders/>
             <w:vAlign w:val="center"/>
           </w:tcPr>
@@ -12188,7 +12178,7 @@
         </w:tc>
         <w:tc>
           <w:tcPr>
-            <w:tcW w:w="2340" w:type="dxa"/>
+            <w:tcW w:w="2331" w:type="dxa"/>
             <w:tcBorders/>
             <w:vAlign w:val="center"/>
           </w:tcPr>
@@ -12240,7 +12230,7 @@
         </w:tc>
         <w:tc>
           <w:tcPr>
-            <w:tcW w:w="1913" w:type="dxa"/>
+            <w:tcW w:w="1922" w:type="dxa"/>
             <w:tcBorders/>
             <w:vAlign w:val="center"/>
           </w:tcPr>
@@ -12341,7 +12331,7 @@
         </w:tc>
         <w:tc>
           <w:tcPr>
-            <w:tcW w:w="2340" w:type="dxa"/>
+            <w:tcW w:w="2331" w:type="dxa"/>
             <w:tcBorders/>
             <w:vAlign w:val="center"/>
           </w:tcPr>
@@ -12393,7 +12383,7 @@
         </w:tc>
         <w:tc>
           <w:tcPr>
-            <w:tcW w:w="1913" w:type="dxa"/>
+            <w:tcW w:w="1922" w:type="dxa"/>
             <w:tcBorders/>
             <w:vAlign w:val="center"/>
           </w:tcPr>
@@ -12494,7 +12484,7 @@
         </w:tc>
         <w:tc>
           <w:tcPr>
-            <w:tcW w:w="2340" w:type="dxa"/>
+            <w:tcW w:w="2331" w:type="dxa"/>
             <w:tcBorders/>
             <w:vAlign w:val="center"/>
           </w:tcPr>
@@ -12572,7 +12562,7 @@
         </w:tc>
         <w:tc>
           <w:tcPr>
-            <w:tcW w:w="1913" w:type="dxa"/>
+            <w:tcW w:w="1922" w:type="dxa"/>
             <w:tcBorders/>
             <w:vAlign w:val="center"/>
           </w:tcPr>
@@ -12693,7 +12683,7 @@
         </w:tc>
         <w:tc>
           <w:tcPr>
-            <w:tcW w:w="2340" w:type="dxa"/>
+            <w:tcW w:w="2331" w:type="dxa"/>
             <w:tcBorders/>
             <w:vAlign w:val="center"/>
           </w:tcPr>
@@ -12745,7 +12735,7 @@
         </w:tc>
         <w:tc>
           <w:tcPr>
-            <w:tcW w:w="1913" w:type="dxa"/>
+            <w:tcW w:w="1922" w:type="dxa"/>
             <w:tcBorders/>
             <w:vAlign w:val="center"/>
           </w:tcPr>
@@ -12836,7 +12826,7 @@
         </w:tc>
         <w:tc>
           <w:tcPr>
-            <w:tcW w:w="2340" w:type="dxa"/>
+            <w:tcW w:w="2331" w:type="dxa"/>
             <w:tcBorders/>
             <w:vAlign w:val="center"/>
           </w:tcPr>
@@ -12888,7 +12878,7 @@
         </w:tc>
         <w:tc>
           <w:tcPr>
-            <w:tcW w:w="1913" w:type="dxa"/>
+            <w:tcW w:w="1922" w:type="dxa"/>
             <w:tcBorders/>
             <w:vAlign w:val="center"/>
           </w:tcPr>
@@ -12989,7 +12979,7 @@
         </w:tc>
         <w:tc>
           <w:tcPr>
-            <w:tcW w:w="2340" w:type="dxa"/>
+            <w:tcW w:w="2331" w:type="dxa"/>
             <w:tcBorders/>
             <w:vAlign w:val="center"/>
           </w:tcPr>
@@ -13041,7 +13031,7 @@
         </w:tc>
         <w:tc>
           <w:tcPr>
-            <w:tcW w:w="1913" w:type="dxa"/>
+            <w:tcW w:w="1922" w:type="dxa"/>
             <w:tcBorders/>
             <w:vAlign w:val="center"/>
           </w:tcPr>
@@ -13132,7 +13122,7 @@
         </w:tc>
         <w:tc>
           <w:tcPr>
-            <w:tcW w:w="2340" w:type="dxa"/>
+            <w:tcW w:w="2331" w:type="dxa"/>
             <w:tcBorders/>
             <w:vAlign w:val="center"/>
           </w:tcPr>
@@ -13184,7 +13174,7 @@
         </w:tc>
         <w:tc>
           <w:tcPr>
-            <w:tcW w:w="1913" w:type="dxa"/>
+            <w:tcW w:w="1922" w:type="dxa"/>
             <w:tcBorders/>
             <w:vAlign w:val="center"/>
           </w:tcPr>

</xml_diff>

<commit_message>
L-0725: review round 1 fixes - malformed guards fails closed, migration never drops silently and takes the config lock, no-python fallback parity with python, removed-key evidence, shipped messages stop citing removed sections
</commit_message>
<xml_diff>
--- a/docs/guides/crew/crew-configuration-reference.docx
+++ b/docs/guides/crew/crew-configuration-reference.docx
@@ -5520,12 +5520,12 @@
         </w:tblCellMar>
       </w:tblPr>
       <w:tblGrid>
-        <w:gridCol w:w="2367"/>
-        <w:gridCol w:w="1254"/>
-        <w:gridCol w:w="1062"/>
-        <w:gridCol w:w="2915"/>
-        <w:gridCol w:w="1280"/>
-        <w:gridCol w:w="2461"/>
+        <w:gridCol w:w="2217"/>
+        <w:gridCol w:w="1170"/>
+        <w:gridCol w:w="1063"/>
+        <w:gridCol w:w="2572"/>
+        <w:gridCol w:w="1220"/>
+        <w:gridCol w:w="3097"/>
       </w:tblGrid>
       <w:tr>
         <w:trPr>
@@ -5533,7 +5533,7 @@
         </w:trPr>
         <w:tc>
           <w:tcPr>
-            <w:tcW w:w="2367" w:type="dxa"/>
+            <w:tcW w:w="2217" w:type="dxa"/>
             <w:tcBorders/>
             <w:vAlign w:val="center"/>
           </w:tcPr>
@@ -5555,7 +5555,7 @@
         </w:tc>
         <w:tc>
           <w:tcPr>
-            <w:tcW w:w="1254" w:type="dxa"/>
+            <w:tcW w:w="1170" w:type="dxa"/>
             <w:tcBorders/>
             <w:vAlign w:val="center"/>
           </w:tcPr>
@@ -5577,7 +5577,7 @@
         </w:tc>
         <w:tc>
           <w:tcPr>
-            <w:tcW w:w="1062" w:type="dxa"/>
+            <w:tcW w:w="1063" w:type="dxa"/>
             <w:tcBorders/>
             <w:vAlign w:val="center"/>
           </w:tcPr>
@@ -5599,7 +5599,7 @@
         </w:tc>
         <w:tc>
           <w:tcPr>
-            <w:tcW w:w="2915" w:type="dxa"/>
+            <w:tcW w:w="2572" w:type="dxa"/>
             <w:tcBorders/>
             <w:vAlign w:val="center"/>
           </w:tcPr>
@@ -5621,7 +5621,7 @@
         </w:tc>
         <w:tc>
           <w:tcPr>
-            <w:tcW w:w="1280" w:type="dxa"/>
+            <w:tcW w:w="1220" w:type="dxa"/>
             <w:tcBorders/>
             <w:vAlign w:val="center"/>
           </w:tcPr>
@@ -5643,7 +5643,7 @@
         </w:tc>
         <w:tc>
           <w:tcPr>
-            <w:tcW w:w="2461" w:type="dxa"/>
+            <w:tcW w:w="3097" w:type="dxa"/>
             <w:tcBorders/>
             <w:vAlign w:val="center"/>
           </w:tcPr>
@@ -5668,7 +5668,7 @@
         <w:trPr/>
         <w:tc>
           <w:tcPr>
-            <w:tcW w:w="2367" w:type="dxa"/>
+            <w:tcW w:w="2217" w:type="dxa"/>
             <w:tcBorders/>
             <w:vAlign w:val="center"/>
           </w:tcPr>
@@ -5691,7 +5691,7 @@
         </w:tc>
         <w:tc>
           <w:tcPr>
-            <w:tcW w:w="1254" w:type="dxa"/>
+            <w:tcW w:w="1170" w:type="dxa"/>
             <w:tcBorders/>
             <w:vAlign w:val="center"/>
           </w:tcPr>
@@ -5712,7 +5712,7 @@
         </w:tc>
         <w:tc>
           <w:tcPr>
-            <w:tcW w:w="1062" w:type="dxa"/>
+            <w:tcW w:w="1063" w:type="dxa"/>
             <w:tcBorders/>
             <w:vAlign w:val="center"/>
           </w:tcPr>
@@ -5735,7 +5735,7 @@
         </w:tc>
         <w:tc>
           <w:tcPr>
-            <w:tcW w:w="2915" w:type="dxa"/>
+            <w:tcW w:w="2572" w:type="dxa"/>
             <w:tcBorders/>
             <w:vAlign w:val="center"/>
           </w:tcPr>
@@ -5766,7 +5766,7 @@
         </w:tc>
         <w:tc>
           <w:tcPr>
-            <w:tcW w:w="1280" w:type="dxa"/>
+            <w:tcW w:w="1220" w:type="dxa"/>
             <w:tcBorders/>
             <w:vAlign w:val="center"/>
           </w:tcPr>
@@ -5787,22 +5787,22 @@
         </w:tc>
         <w:tc>
           <w:tcPr>
-            <w:tcW w:w="2461" w:type="dxa"/>
-            <w:tcBorders/>
-            <w:vAlign w:val="center"/>
-          </w:tcPr>
-          <w:p>
-            <w:pPr>
-              <w:pStyle w:val="TableContents"/>
-              <w:shd w:fill="2E3440" w:val="clear"/>
-              <w:bidi w:val="0"/>
-              <w:spacing w:before="120" w:after="120"/>
-              <w:jc w:val="left"/>
-              <w:rPr/>
-            </w:pPr>
-            <w:r>
-              <w:rPr/>
-              <w:t>Jira project key. No consumer found (CONFIG.md section 9).</w:t>
+            <w:tcW w:w="3097" w:type="dxa"/>
+            <w:tcBorders/>
+            <w:vAlign w:val="center"/>
+          </w:tcPr>
+          <w:p>
+            <w:pPr>
+              <w:pStyle w:val="TableContents"/>
+              <w:shd w:fill="2E3440" w:val="clear"/>
+              <w:bidi w:val="0"/>
+              <w:spacing w:before="120" w:after="120"/>
+              <w:jc w:val="left"/>
+              <w:rPr/>
+            </w:pPr>
+            <w:r>
+              <w:rPr/>
+              <w:t>Jira project key. No consumer found (docs/crew/config-rationale.md).</w:t>
             </w:r>
           </w:p>
         </w:tc>
@@ -5811,7 +5811,7 @@
         <w:trPr/>
         <w:tc>
           <w:tcPr>
-            <w:tcW w:w="2367" w:type="dxa"/>
+            <w:tcW w:w="2217" w:type="dxa"/>
             <w:tcBorders/>
             <w:vAlign w:val="center"/>
           </w:tcPr>
@@ -5834,7 +5834,7 @@
         </w:tc>
         <w:tc>
           <w:tcPr>
-            <w:tcW w:w="1254" w:type="dxa"/>
+            <w:tcW w:w="1170" w:type="dxa"/>
             <w:tcBorders/>
             <w:vAlign w:val="center"/>
           </w:tcPr>
@@ -5855,7 +5855,7 @@
         </w:tc>
         <w:tc>
           <w:tcPr>
-            <w:tcW w:w="1062" w:type="dxa"/>
+            <w:tcW w:w="1063" w:type="dxa"/>
             <w:tcBorders/>
             <w:vAlign w:val="center"/>
           </w:tcPr>
@@ -5878,7 +5878,7 @@
         </w:tc>
         <w:tc>
           <w:tcPr>
-            <w:tcW w:w="2915" w:type="dxa"/>
+            <w:tcW w:w="2572" w:type="dxa"/>
             <w:tcBorders/>
             <w:vAlign w:val="center"/>
           </w:tcPr>
@@ -5909,7 +5909,7 @@
         </w:tc>
         <w:tc>
           <w:tcPr>
-            <w:tcW w:w="1280" w:type="dxa"/>
+            <w:tcW w:w="1220" w:type="dxa"/>
             <w:tcBorders/>
             <w:vAlign w:val="center"/>
           </w:tcPr>
@@ -5930,7 +5930,7 @@
         </w:tc>
         <w:tc>
           <w:tcPr>
-            <w:tcW w:w="2461" w:type="dxa"/>
+            <w:tcW w:w="3097" w:type="dxa"/>
             <w:tcBorders/>
             <w:vAlign w:val="center"/>
           </w:tcPr>
@@ -14934,12 +14934,12 @@
         </w:tblCellMar>
       </w:tblPr>
       <w:tblGrid>
-        <w:gridCol w:w="3103"/>
-        <w:gridCol w:w="1084"/>
+        <w:gridCol w:w="2943"/>
+        <w:gridCol w:w="990"/>
         <w:gridCol w:w="1062"/>
-        <w:gridCol w:w="2423"/>
-        <w:gridCol w:w="1173"/>
-        <w:gridCol w:w="2494"/>
+        <w:gridCol w:w="2294"/>
+        <w:gridCol w:w="1099"/>
+        <w:gridCol w:w="2951"/>
       </w:tblGrid>
       <w:tr>
         <w:trPr>
@@ -14947,7 +14947,7 @@
         </w:trPr>
         <w:tc>
           <w:tcPr>
-            <w:tcW w:w="3103" w:type="dxa"/>
+            <w:tcW w:w="2943" w:type="dxa"/>
             <w:tcBorders/>
             <w:vAlign w:val="center"/>
           </w:tcPr>
@@ -14969,7 +14969,7 @@
         </w:tc>
         <w:tc>
           <w:tcPr>
-            <w:tcW w:w="1084" w:type="dxa"/>
+            <w:tcW w:w="990" w:type="dxa"/>
             <w:tcBorders/>
             <w:vAlign w:val="center"/>
           </w:tcPr>
@@ -15013,7 +15013,7 @@
         </w:tc>
         <w:tc>
           <w:tcPr>
-            <w:tcW w:w="2423" w:type="dxa"/>
+            <w:tcW w:w="2294" w:type="dxa"/>
             <w:tcBorders/>
             <w:vAlign w:val="center"/>
           </w:tcPr>
@@ -15035,7 +15035,7 @@
         </w:tc>
         <w:tc>
           <w:tcPr>
-            <w:tcW w:w="1173" w:type="dxa"/>
+            <w:tcW w:w="1099" w:type="dxa"/>
             <w:tcBorders/>
             <w:vAlign w:val="center"/>
           </w:tcPr>
@@ -15057,7 +15057,7 @@
         </w:tc>
         <w:tc>
           <w:tcPr>
-            <w:tcW w:w="2494" w:type="dxa"/>
+            <w:tcW w:w="2951" w:type="dxa"/>
             <w:tcBorders/>
             <w:vAlign w:val="center"/>
           </w:tcPr>
@@ -15082,7 +15082,7 @@
         <w:trPr/>
         <w:tc>
           <w:tcPr>
-            <w:tcW w:w="3103" w:type="dxa"/>
+            <w:tcW w:w="2943" w:type="dxa"/>
             <w:tcBorders/>
             <w:vAlign w:val="center"/>
           </w:tcPr>
@@ -15105,7 +15105,7 @@
         </w:tc>
         <w:tc>
           <w:tcPr>
-            <w:tcW w:w="1084" w:type="dxa"/>
+            <w:tcW w:w="990" w:type="dxa"/>
             <w:tcBorders/>
             <w:vAlign w:val="center"/>
           </w:tcPr>
@@ -15149,7 +15149,7 @@
         </w:tc>
         <w:tc>
           <w:tcPr>
-            <w:tcW w:w="2423" w:type="dxa"/>
+            <w:tcW w:w="2294" w:type="dxa"/>
             <w:tcBorders/>
             <w:vAlign w:val="center"/>
           </w:tcPr>
@@ -15200,7 +15200,7 @@
         </w:tc>
         <w:tc>
           <w:tcPr>
-            <w:tcW w:w="1173" w:type="dxa"/>
+            <w:tcW w:w="1099" w:type="dxa"/>
             <w:tcBorders/>
             <w:vAlign w:val="center"/>
           </w:tcPr>
@@ -15221,7 +15221,7 @@
         </w:tc>
         <w:tc>
           <w:tcPr>
-            <w:tcW w:w="2494" w:type="dxa"/>
+            <w:tcW w:w="2951" w:type="dxa"/>
             <w:tcBorders/>
             <w:vAlign w:val="center"/>
           </w:tcPr>
@@ -15246,7 +15246,7 @@
             </w:r>
             <w:r>
               <w:rPr/>
-              <w:t>. The two layers combine by union, so a repo can add a token and never remove the machine owner's; a value that is not a list of tokens makes the list unknown, never empty (CONFIG.md section 22).</w:t>
+              <w:t>. The two layers combine by union, so a repo can add a token and never remove the machine owner's; a value that is not a list of tokens makes the list unknown, never empty (docs/crew/config-rationale.md).</w:t>
             </w:r>
           </w:p>
         </w:tc>

</xml_diff>